<commit_message>
Maitê Proença: revisão da parte 4
Co-Authored-By: Claude Opus 5.5 <noreply@anthropic.com>
Claude-Session: https://claude.ai/code/session_01MJjUEEZrxQDEUifKK2vj9g
</commit_message>
<xml_diff>
--- a/roteiros/maite-proenca/MaiteProenca_Parte4.docx
+++ b/roteiros/maite-proenca/MaiteProenca_Parte4.docx
@@ -55,15 +55,7 @@
         <w:rPr>
           <w:color w:val="000000"/>
         </w:rPr>
-        <w:t>Foi nesse momento da vida que ela encontrou o palco.</w:t>
-      </w:r>
-    </w:p>
-    <w:p>
-      <w:r>
-        <w:rPr>
-          <w:color w:val="000000"/>
-        </w:rPr>
-        <w:t>Maitê descobriu a interpretação e, com ela, uma forma de sobreviver. Anos depois, diria que a arte ajudou a fazer dela uma pessoa menos amarga.</w:t>
+        <w:t>Foi nesses anos longe do Brasil que ela descobriu a interpretação. E, com ela, uma forma de sobreviver. Anos depois, diria que a arte ajudou a fazer dela uma pessoa menos amarga.</w:t>
       </w:r>
     </w:p>
     <w:p>
@@ -87,7 +79,7 @@
         <w:rPr>
           <w:color w:val="000000"/>
         </w:rPr>
-        <w:t>A menina de Campinas, que tinha passado pelo tribunal, pelo internato e por Paris, virou rosto conhecido em todo o país.</w:t>
+        <w:t>A menina de Campinas, que tinha passado pelo tribunal e por Paris, virou rosto conhecido em todo o país.</w:t>
       </w:r>
     </w:p>
     <w:p>
@@ -95,7 +87,7 @@
         <w:rPr>
           <w:color w:val="C00000"/>
         </w:rPr>
-        <w:t>Só que existe uma contradição cruel nessa virada. Enquanto o Brasil começava a se apaixonar por aquela atriz, ninguém fazia ideia do que ela carregava. E ela ia guardar esse segredo por muito mais tempo do que você imagina.</w:t>
+        <w:t>Só que existe uma contradição cruel nessa virada. Enquanto o Brasil começava a se apaixonar por aquela atriz, quase ninguém ligava aquele rosto ao crime de Campinas. E ela ia guardar esse segredo por muito mais tempo do que você imagina.</w:t>
       </w:r>
     </w:p>
     <w:p>
@@ -223,7 +215,7 @@
         <w:rPr>
           <w:color w:val="C00000"/>
         </w:rPr>
-        <w:t>Aqui vem a parte mais difícil de ouvir de toda essa história. Porque, no pior momento da doença, aquele pai fez um pedido à filha que nenhum filho deveria ouvir. E o que ela respondeu mudou o fim daquela família para sempre.</w:t>
+        <w:t>Aqui vem a parte mais difícil de ouvir de toda essa história. Porque, no pior momento da doença, aquele pai fez um pedido à filha que nenhum filho deveria ouvir. E o que aconteceu depois da resposta dela é uma das partes mais duras dessa história.</w:t>
       </w:r>
     </w:p>
     <w:p>
@@ -335,7 +327,7 @@
         <w:rPr>
           <w:color w:val="C00000"/>
         </w:rPr>
-        <w:t>Imagine perder o pai e o irmão no mesmo ano, dezenove anos depois de perder a mãe. E ainda precisar sorrir para uma câmera no dia seguinte. Maitê fez isso. Mas o preço ia aparecer de outro jeito, e ela mesma só ia entender muitos anos depois.</w:t>
+        <w:t>Imagine perder o pai e o irmão no mesmo ano, dezenove anos depois de perder a mãe, com o país inteiro olhando para você. O preço daquilo ia aparecer de outro jeito, e ela mesma só ia entender muitos anos depois.</w:t>
       </w:r>
     </w:p>
     <w:p>
@@ -375,7 +367,7 @@
         <w:rPr>
           <w:color w:val="000000"/>
         </w:rPr>
-        <w:t>Ela seguiu em frente do único jeito que conhecia. Trabalhando sem parar.</w:t>
+        <w:t>Ela seguiu em frente do único jeito que conhecia. Trabalhando.</w:t>
       </w:r>
     </w:p>
     <w:p>

</xml_diff>